<commit_message>
Point the report at the repository
</commit_message>
<xml_diff>
--- a/report/Optimization of Energy Systems Assignment Report.docx
+++ b/report/Optimization of Energy Systems Assignment Report.docx
@@ -185,7 +185,7 @@
           <w:sz w:val="19"/>
           <w:szCs w:val="19"/>
         </w:rPr>
-        <w:t xml:space="preserve">https://github.com/&lt;your-account&gt;/chpd-dhn-flexibility</w:t>
+        <w:t xml:space="preserve">https://github.com/DeusExMachina25/chpd-dhn-flexibility</w:t>
       </w:r>
     </w:p>
     <w:p>
@@ -7727,7 +7727,7 @@
           <w:sz w:val="19"/>
           <w:szCs w:val="19"/>
         </w:rPr>
-        <w:t xml:space="preserve">https://github.com/&lt;your-account&gt;/chpd-dhn-flexibility</w:t>
+        <w:t xml:space="preserve">https://github.com/DeusExMachina25/chpd-dhn-flexibility</w:t>
       </w:r>
       <w:r>
         <w:rPr>

</xml_diff>

<commit_message>
Tighten the report's prose
</commit_message>
<xml_diff>
--- a/report/Optimization of Energy Systems Assignment Report.docx
+++ b/report/Optimization of Energy Systems Assignment Report.docx
@@ -213,7 +213,7 @@
           <w:sz w:val="21"/>
           <w:szCs w:val="21"/>
         </w:rPr>
-        <w:t xml:space="preserve">A district heating network (DHN) delivers heat by circulating hot water from heat stations to consumers and returning it cooled. Because water takes a finite time to travel down a pipe, the network itself stores thermal energy: heat can be produced before it is needed and delivered later.</w:t>
+        <w:t xml:space="preserve">A district heating network delivers heat by pumping hot water from stations out to consumers and returning it cooled. Water takes time to travel down a pipe, so the network stores heat by itself: produce it early, deliver it later.</w:t>
       </w:r>
     </w:p>
     <w:p>
@@ -226,7 +226,7 @@
           <w:sz w:val="21"/>
           <w:szCs w:val="21"/>
         </w:rPr>
-        <w:t xml:space="preserve">That matters because an extraction combined heat and power (CHP) unit cannot set its electrical and thermal output independently. A CHP forced to follow the heat load is pushed away from its electrically efficient operating point, and wind may have to be curtailed to accommodate it. If the network can store heat, the CHP is free to follow the electricity system instead.</w:t>
+        <w:t xml:space="preserve">That matters because an extraction CHP unit cannot choose its heat and power output independently. A CHP tied to the heat load gets pushed off its efficient electrical operating point, and wind may be curtailed to make room for it. Let the network hold heat instead, and the CHP is free to follow the electricity system.</w:t>
       </w:r>
     </w:p>
     <w:p>
@@ -239,7 +239,7 @@
           <w:sz w:val="21"/>
           <w:szCs w:val="21"/>
         </w:rPr>
-        <w:t xml:space="preserve">Mitridati and Taylor formalise this as a Combined Heat and Power Dispatch (CHPD), co-optimising a DC optimal power flow with the hydraulic and thermal state of the heating network. The model is non-convex, so they also propose a convex relaxation. This report reproduces both: the </w:t>
+        <w:t xml:space="preserve">Mitridati and Taylor turn this into a Combined Heat and Power Dispatch (CHPD), co-optimising a DC optimal power flow with the hydraulic and thermal state of the heating network. It is non-convex, so they also give a convex relaxation. This report rebuilds both in Julia/JuMP — the </w:t>
       </w:r>
       <w:r>
         <w:rPr>
@@ -275,7 +275,7 @@
           <w:sz w:val="21"/>
           <w:szCs w:val="21"/>
         </w:rPr>
-        <w:t xml:space="preserve"> relaxation, implemented in Julia/JuMP and validated at a single time step, which is the scope of the assignment. A conventional economic dispatch benchmark and the pipeline time delays were also implemented and are reported briefly as extensions.</w:t>
+        <w:t xml:space="preserve"> relaxation — and validates them at a single time step, which is the scope of the assignment. A conventional economic dispatch and the pipeline time delays were built as well, and are reported briefly at the end.</w:t>
       </w:r>
     </w:p>
     <w:p>
@@ -298,7 +298,7 @@
           <w:sz w:val="21"/>
           <w:szCs w:val="21"/>
         </w:rPr>
-        <w:t xml:space="preserve">The CHPD minimises total operating cost over a scheduling horizon subject to the physics of both networks at once. On the electricity side it is a linearised optimal power flow: generator outputs, voltage angles and line flows, subject to nodal power balance, line limits and generator bounds. On the heating side it carries the mass flows, nodal pressures and temperatures, and pipe inlet and outlet temperatures, subject to friction pressure loss, thermal loss, nodal mass balance and temperature mixing. The two are coupled by CHP units, heat pumps, and the water pumps that drive flow against the supply-to-return pressure difference.</w:t>
+        <w:t xml:space="preserve">The CHPD minimises operating cost subject to the physics of both networks at once. On the electricity side it is a linearised optimal power flow: generator outputs, voltage angles and line flows. On the heating side it carries the mass flows, nodal pressures and temperatures, and pipe inlet and outlet temperatures, subject to friction, thermal loss, mass balance and temperature mixing. CHP units, heat pumps and water pumps couple the two together.</w:t>
       </w:r>
     </w:p>
     <w:p>
@@ -311,7 +311,7 @@
           <w:sz w:val="21"/>
           <w:szCs w:val="21"/>
         </w:rPr>
-        <w:t xml:space="preserve">Three structural features make it hard, and they are why a relaxation is needed:</w:t>
+        <w:t xml:space="preserve">Three features make it hard, and they are why a relaxation is needed:</w:t>
       </w:r>
     </w:p>
     <w:p>
@@ -339,7 +339,7 @@
           <w:sz w:val="21"/>
           <w:szCs w:val="21"/>
         </w:rPr>
-        <w:t xml:space="preserve">Heat transported is a mass flow times a temperature difference, so heat delivered at a load, heat produced at a station, nodal temperature mixing and water pump power — Eqs. (16), (17), (21), (24), (27) — are all products of two decision variables.</w:t>
+        <w:t xml:space="preserve">Heat carried is a mass flow times a temperature difference, so heat delivered at a load, heat produced at a station, nodal mixing and pump power — Eqs. (16), (17), (21), (24), (27) — are each a product of two variables.</w:t>
       </w:r>
     </w:p>
     <w:p>
@@ -367,7 +367,7 @@
           <w:sz w:val="21"/>
           <w:szCs w:val="21"/>
         </w:rPr>
-        <w:t xml:space="preserve">Pressure loss is proportional to the square of the mass flow, Eq. (2); as an equality this is a non-convex surface.</w:t>
+        <w:t xml:space="preserve">Pressure loss goes with the square of the mass flow, Eq. (2); as an equality that is a non-convex surface.</w:t>
       </w:r>
     </w:p>
     <w:p>
@@ -395,7 +395,7 @@
           <w:sz w:val="21"/>
           <w:szCs w:val="21"/>
         </w:rPr>
-        <w:t xml:space="preserve">Pipe travel time is itself a decision variable, discretised into whole steps with binaries and big-M logic, Eqs. (6)–(13).</w:t>
+        <w:t xml:space="preserve">Pipe travel time is itself a variable, cut into whole steps with binaries and big-M logic, Eqs. (6)–(13).</w:t>
       </w:r>
     </w:p>
     <w:p>
@@ -431,7 +431,7 @@
           <w:sz w:val="21"/>
           <w:szCs w:val="21"/>
         </w:rPr>
-        <w:t xml:space="preserve">Both models are built on identical data, so any difference comes from the formulation alone: the relaxation is constructed by building the Section II model and replacing exactly the constraints the paper replaces, guaranteeing the two differ nowhere else.</w:t>
+        <w:t xml:space="preserve">Both models use identical data, so any difference between them comes from the formulation alone. The relaxation is built by constructing the Section II model and replacing exactly the constraints the paper replaces, so the two differ nowhere else.</w:t>
       </w:r>
     </w:p>
     <w:p>
@@ -1614,7 +1614,7 @@
           <w:sz w:val="21"/>
           <w:szCs w:val="21"/>
         </w:rPr>
-        <w:t xml:space="preserve">The quadratic equality (2) is replaced by the convex quadratic inequality (36), relaxing it to the convex side of the surface:</w:t>
+        <w:t xml:space="preserve">The quadratic equality (2) becomes the convex quadratic inequality (36), relaxed to the convex side of the surface:</w:t>
       </w:r>
     </w:p>
     <w:p>
@@ -1651,7 +1651,7 @@
           <w:sz w:val="21"/>
           <w:szCs w:val="21"/>
         </w:rPr>
-        <w:t xml:space="preserve">Each product w = x·y over a box [xₗ, xᵤ] × [yₗ, yᵤ] is replaced by its McCormick envelope, the tightest linear relaxation of a bilinear term on a box:</w:t>
+        <w:t xml:space="preserve">Each product w = x·y on a box [xₗ, xᵤ] × [yₗ, yᵤ] becomes its McCormick envelope, the tightest linear relaxation of a bilinear term on a box:</w:t>
       </w:r>
     </w:p>
     <w:p>
@@ -1692,7 +1692,7 @@
           <w:sz w:val="21"/>
           <w:szCs w:val="21"/>
         </w:rPr>
-        <w:t xml:space="preserve">Two implementation choices materially improve tightness, since the quality of a McCormick relaxation is set almost entirely by the width of the box:</w:t>
+        <w:t xml:space="preserve">Two choices matter for tightness, because a McCormick relaxation is only as good as the box it is built on:</w:t>
       </w:r>
     </w:p>
     <w:p>
@@ -1712,15 +1712,15 @@
           <w:sz w:val="21"/>
           <w:szCs w:val="21"/>
         </w:rPr>
-        <w:t xml:space="preserve">The temperature difference is enveloped as a single variable. </w:t>
-      </w:r>
-      <w:r>
-        <w:rPr>
-          <w:rFonts w:ascii="Calibri" w:cs="Calibri" w:eastAsia="Calibri" w:hAnsi="Calibri"/>
-          <w:sz w:val="21"/>
-          <w:szCs w:val="21"/>
-        </w:rPr>
-        <w:t xml:space="preserve">For (21) and (24) the envelope is built on ΔT = TS − TR rather than on TS and TR separately — one product instead of two, over a much narrower interval.</w:t>
+        <w:t xml:space="preserve">Envelope the temperature difference, not the temperatures. </w:t>
+      </w:r>
+      <w:r>
+        <w:rPr>
+          <w:rFonts w:ascii="Calibri" w:cs="Calibri" w:eastAsia="Calibri" w:hAnsi="Calibri"/>
+          <w:sz w:val="21"/>
+          <w:szCs w:val="21"/>
+        </w:rPr>
+        <w:t xml:space="preserve">For (21) and (24) the envelope uses ΔT = TS − TR as a single variable rather than TS and TR separately — one product instead of two, over a much narrower interval.</w:t>
       </w:r>
     </w:p>
     <w:p>
@@ -1740,7 +1740,7 @@
           <w:sz w:val="21"/>
           <w:szCs w:val="21"/>
         </w:rPr>
-        <w:t xml:space="preserve">Exact constraints are not relaxed. </w:t>
+        <w:t xml:space="preserve">Do not relax what is already exact. </w:t>
       </w:r>
       <w:r>
         <w:rPr>
@@ -1761,7 +1761,7 @@
           <w:sz w:val="21"/>
           <w:szCs w:val="21"/>
         </w:rPr>
-        <w:t xml:space="preserve">With the delays off there are no binaries left, so the relaxed model is a convex quadratically constrained program rather than a MISOCP.</w:t>
+        <w:t xml:space="preserve">With the delays off no binaries remain, so the relaxed model is a convex quadratically constrained program rather than a MISOCP.</w:t>
       </w:r>
     </w:p>
     <w:p>
@@ -1784,7 +1784,7 @@
           <w:sz w:val="21"/>
           <w:szCs w:val="21"/>
         </w:rPr>
-        <w:t xml:space="preserve">The study is a Julia/JuMP project driven by one entry point, </w:t>
+        <w:t xml:space="preserve">A single entry point drives the study, </w:t>
       </w:r>
       <w:r>
         <w:rPr>
@@ -1800,7 +1800,7 @@
           <w:sz w:val="21"/>
           <w:szCs w:val="21"/>
         </w:rPr>
-        <w:t xml:space="preserve">, with the horizon, start hour and delay switch given as command-line arguments so no file needs editing to change what is solved. Section II is non-convex and is solved with Gurobi's spatial branch and bound (</w:t>
+        <w:t xml:space="preserve">, taking the horizon, start hour and delay switch as command-line arguments, so nothing has to be edited to change what is solved. Gurobi solves the non-convex Section II by spatial branch and bound (</w:t>
       </w:r>
       <w:r>
         <w:rPr>
@@ -1816,7 +1816,7 @@
           <w:sz w:val="21"/>
           <w:szCs w:val="21"/>
         </w:rPr>
-        <w:t xml:space="preserve">), which returns a certified global optimum; Section III-B is convex. The code detects whether a licensed Gurobi is present and falls back to Ipopt and HiGHS otherwise, so it runs without a commercial licence.</w:t>
+        <w:t xml:space="preserve">), which returns a certified global optimum; Section III-B is convex. Without a licensed Gurobi the code falls back to Ipopt and HiGHS, so it still runs.</w:t>
       </w:r>
     </w:p>
     <w:p>
@@ -2135,7 +2135,7 @@
           <w:sz w:val="21"/>
           <w:szCs w:val="21"/>
         </w:rPr>
-        <w:t xml:space="preserve">The first of these is the one that would normally be settled with the lecturer or TA before relying on it. The nomenclature calls ρE and ρH fuel efficiencies, but they appear multiplying outputs and being compared against a fuel limit, which only balances dimensionally if they are the reciprocals. Reading them as stated would change the CHP's fuel constraint and its cost by a factor of ρ², so the choice is not cosmetic. It is adopted here because it is the only dimensionally coherent reading and because the resulting CED reproduces the paper's published cost exactly, but it remains an assumption that ought to be confirmed rather than inferred.</w:t>
+        <w:t xml:space="preserve">The first of these is the one to settle with the lecturer or TA rather than assume. The nomenclature calls ρE and ρH fuel efficiencies, yet they multiply outputs and are compared against a fuel limit, which only balances dimensionally if they are the reciprocals. Taking them as written would change the CHP's fuel constraint and its cost by a factor of ρ², so the choice is not cosmetic. It is adopted because it is the only dimensionally coherent reading, and because the CED then reproduces the paper's published cost exactly — but it stays an assumption worth confirming.</w:t>
       </w:r>
     </w:p>
     <w:p>
@@ -2160,15 +2160,15 @@
           <w:sz w:val="21"/>
           <w:szCs w:val="21"/>
         </w:rPr>
-        <w:t xml:space="preserve">The relaxation was initially very loose, and the bound width was the whole story. </w:t>
-      </w:r>
-      <w:r>
-        <w:rPr>
-          <w:rFonts w:ascii="Calibri" w:cs="Calibri" w:eastAsia="Calibri" w:hAnsi="Calibri"/>
-          <w:sz w:val="21"/>
-          <w:szCs w:val="21"/>
-        </w:rPr>
-        <w:t xml:space="preserve">On an earlier case study reconstructed from the paper's figures, the first relaxed run came back 50 % below the original. Nothing was wrong with the formulation: the flow bounds were equipment nameplates while the actual flows sat in a narrow band. For w = x·y on a box the McCormick hull can sit (xᵤ−xₗ)(yᵤ−yₗ)/4 from the true surface — 83 MW of slack on a 98 MW load, enough to serve it without moving any water. Replacing those with bounds implied by the model's own constraints (a station moving heat X across a ΔT confined by (18) must run a flow between X/(c·ΔTᵤ) and X/(c·ΔTₗ)) closed it to 23.2 %, and on the authors' data it is under 1 %.</w:t>
+        <w:t xml:space="preserve">The relaxation was far too loose at first, and bound width was the whole story. </w:t>
+      </w:r>
+      <w:r>
+        <w:rPr>
+          <w:rFonts w:ascii="Calibri" w:cs="Calibri" w:eastAsia="Calibri" w:hAnsi="Calibri"/>
+          <w:sz w:val="21"/>
+          <w:szCs w:val="21"/>
+        </w:rPr>
+        <w:t xml:space="preserve">On an earlier case study rebuilt from the paper's figures, the first relaxed run came back 50 % under the original. The formulation was fine; the flow bounds were equipment nameplates while the real flows sat in a narrow band. For w = x·y the McCormick hull can sit (xᵤ−xₗ)(yᵤ−yₗ)/4 from the true surface — 83 MW of slack on a 98 MW load, enough to serve it without moving any water. Bounds implied by the model's own constraints closed that to 23.2 %, and on the authors' data it is under 1 %.</w:t>
       </w:r>
     </w:p>
     <w:p>
@@ -2183,15 +2183,15 @@
           <w:sz w:val="21"/>
           <w:szCs w:val="21"/>
         </w:rPr>
-        <w:t xml:space="preserve">Two real bugs were exposed by switching to the authors' data. </w:t>
-      </w:r>
-      <w:r>
-        <w:rPr>
-          <w:rFonts w:ascii="Calibri" w:cs="Calibri" w:eastAsia="Calibri" w:hAnsi="Calibri"/>
-          <w:sz w:val="21"/>
-          <w:szCs w:val="21"/>
-        </w:rPr>
-        <w:t xml:space="preserve">The thermal loss bracket in Eq. (5) is multiplied by the delay τ, so at τ = 0 it equals one and a pipe crossed within one step loses nothing; the code was charging a full step of loss. On the reconstruction this merely inflated losses, but on the authors' data it made the model </w:t>
+        <w:t xml:space="preserve">The authors' data exposed two real bugs. </w:t>
+      </w:r>
+      <w:r>
+        <w:rPr>
+          <w:rFonts w:ascii="Calibri" w:cs="Calibri" w:eastAsia="Calibri" w:hAnsi="Calibri"/>
+          <w:sz w:val="21"/>
+          <w:szCs w:val="21"/>
+        </w:rPr>
+        <w:t xml:space="preserve">The loss bracket in Eq. (5) is multiplied by the delay τ, so at τ = 0 it equals one and a pipe crossed inside one step loses nothing — but the code was charging a full step of loss. On the reconstruction that only inflated losses; on the authors' data it made the model </w:t>
       </w:r>
       <w:r>
         <w:rPr>
@@ -2209,7 +2209,7 @@
           <w:sz w:val="21"/>
           <w:szCs w:val="21"/>
         </w:rPr>
-        <w:t xml:space="preserve"> — their pipes lose 4.27 % of absolute temperature per step, so two in series drop a 393.15 K supply below the 363.15 K floor of Eq. (18) — and that infeasibility is what exposed it. The second was the missing zero-delay consistency bound in Table 2.</w:t>
+        <w:t xml:space="preserve">, since their pipes lose 4.27 % of absolute temperature per step and two in series drop a 393.15 K supply below the 363.15 K floor of Eq. (18). The infeasibility is what found it. The second bug was the missing zero-delay consistency bound in Table 2.</w:t>
       </w:r>
     </w:p>
     <w:p>
@@ -2224,15 +2224,15 @@
           <w:sz w:val="21"/>
           <w:szCs w:val="21"/>
         </w:rPr>
-        <w:t xml:space="preserve">Solver licensing turned into a cross-check. </w:t>
-      </w:r>
-      <w:r>
-        <w:rPr>
-          <w:rFonts w:ascii="Calibri" w:cs="Calibri" w:eastAsia="Calibri" w:hAnsi="Calibri"/>
-          <w:sz w:val="21"/>
-          <w:szCs w:val="21"/>
-        </w:rPr>
-        <w:t xml:space="preserve">Gurobi was initially unlicensed, so early work ran on Ipopt, which finds a </w:t>
+        <w:t xml:space="preserve">An unlicensed solver turned into a cross-check. </w:t>
+      </w:r>
+      <w:r>
+        <w:rPr>
+          <w:rFonts w:ascii="Calibri" w:cs="Calibri" w:eastAsia="Calibri" w:hAnsi="Calibri"/>
+          <w:sz w:val="21"/>
+          <w:szCs w:val="21"/>
+        </w:rPr>
+        <w:t xml:space="preserve">Early work ran on Ipopt, which finds a </w:t>
       </w:r>
       <w:r>
         <w:rPr>
@@ -2268,7 +2268,7 @@
           <w:sz w:val="21"/>
           <w:szCs w:val="21"/>
         </w:rPr>
-        <w:t xml:space="preserve"> one. Both agreed to six significant figures, which is evidence that this case has no stray local optima.</w:t>
+        <w:t xml:space="preserve"> one. The two agreed to six significant figures, which suggests this case has no stray local optima.</w:t>
       </w:r>
     </w:p>
     <w:p>
@@ -2291,7 +2291,7 @@
           <w:sz w:val="21"/>
           <w:szCs w:val="21"/>
         </w:rPr>
-        <w:t xml:space="preserve">Correctness is not asserted from an objective value. Four checks are applied: 15 unit tests, including one that the McCormick helper reproduces a known product exactly at the corners of its box and brackets it inside; a two-node network whose optimal dispatch is derived by hand and matched to 1e-4; physical checks on the solution (mass, heat and power balance, CHP region, heat pump conversion); and confirmation that the relaxation bounds the original from below.</w:t>
+        <w:t xml:space="preserve">No claim here rests on an objective value alone. Four checks stand behind it: 15 unit tests, one confirming that the McCormick helper reproduces a known product exactly at the corners of its box and brackets it inside; a two-node network whose optimum is derived by hand and matched to 1e-4; physical checks on the solution; and confirmation that the relaxation bounds the original from below.</w:t>
       </w:r>
     </w:p>
     <w:p>
@@ -2304,7 +2304,7 @@
           <w:sz w:val="21"/>
           <w:szCs w:val="21"/>
         </w:rPr>
-        <w:t xml:space="preserve">The hand-derived test earned its place. Its first version assumed the return temperature at the load would sit on its own lower bound, and it failed. The model was right — the water arrives already cooled, so the bound at the far end of the pipe binds first. The derivation was corrected, not the code.</w:t>
+        <w:t xml:space="preserve">The hand-derived test earned its place. Its first version assumed the return temperature at the load would sit on its own lower bound, and it failed. The model was right: the water arrives already cooled, so the bound at the far end of the pipe binds first. The derivation was wrong, not the code.</w:t>
       </w:r>
     </w:p>
     <w:p>
@@ -2327,7 +2327,7 @@
           <w:sz w:val="21"/>
           <w:szCs w:val="21"/>
         </w:rPr>
-        <w:t xml:space="preserve">All results use the authors' own data, from their online appendix (doi:10.5281/zenodo.1195508) and reference implementation. The system is a 6-bus network whose first three buses are also the DHN nodes, arranged as a line: node 1 (heat pump HP1, wind W1) → node 2 (CHP1, generator G2) → node 3 (the heat load HES1). Parameters are in Appendix A. Because every node has at most one arriving pipe, Eqs. (19)/(20) apply throughout and the mixing equations (16)/(17) are never active — their envelopes are implemented and correct but have nothing to relax here, which the measured mixing residuals of exactly zero confirm. Only (21), (24) and (27) are actually relaxed.</w:t>
+        <w:t xml:space="preserve">Everything below uses the authors' own data, from their online appendix (doi:10.5281/zenodo.1195508) and reference code. The system is a 6-bus network whose first three buses are also the DHN nodes, arranged in a line: node 1 (heat pump HP1, wind W1) → node 2 (CHP1, generator G2) → node 3 (the heat load HES1); parameters are in Appendix A. Every node has at most one arriving pipe, so Eqs. (19)/(20) apply throughout and the mixing equations (16)/(17) never bind — their envelopes are correct but have nothing to relax here, as the measured mixing residuals of exactly zero confirm. Only (21), (24) and (27) are actually relaxed.</w:t>
       </w:r>
     </w:p>
     <w:tbl>
@@ -2987,7 +2987,7 @@
           <w:sz w:val="21"/>
           <w:szCs w:val="21"/>
         </w:rPr>
-        <w:t xml:space="preserve">Hour 1 is degenerate and is reported as a validation case only: near-free wind covers all electricity demand, CHP1 sits at P = Q = 0, and the total cost is two cents, so its cost comparisons carry no economic meaning. Hour 20 is the informative one. Wind collapses while the heat load peaks, so every cheap resource is exhausted — all available wind is taken, G1 runs at its 180 MW cap, and CHP1 is driven to its fuel limit at exactly 250.0 of 250.0 MW — leaving the expensive G2 to cover the remaining 3.59 MW (Figure 1). The dispatch closes: 316.87 MW generated against 275 MW of load plus 41.32 MW of heat pump and 0.54 MW of water pump demand.</w:t>
+        <w:t xml:space="preserve">Hour 1 is degenerate, and is here only to validate: near-free wind covers all demand, CHP1 sits at P = Q = 0, and the total cost is two cents, so its cost comparisons mean nothing. Hour 20 is the interesting one. Wind collapses just as the heat load peaks, exhausting every cheap resource — all available wind is taken, G1 runs at its 180 MW cap, and CHP1 hits its fuel limit at exactly 250.0 of 250.0 MW — which leaves the expensive G2 to cover the last 3.59 MW (Figure 1). The dispatch closes: 316.87 MW generated against 275 MW of load plus 41.32 MW of heat pump and 0.54 MW of water pump demand.</w:t>
       </w:r>
     </w:p>
     <w:p>
@@ -3049,7 +3049,7 @@
           <w:sz w:val="17"/>
           <w:szCs w:val="17"/>
         </w:rPr>
-        <w:t xml:space="preserve">Figure 1. Section II dispatch at hour 20. The 110.99 MW heat load is met by the heat pump (103.31 MW) with the CHP topping up (7.68 MW). On the electricity side G1 is at its 180 MW cap, all 29.91 MW of available wind is taken, the CHP supplies 103.37 MW at its fuel limit, and the expensive G2 is dispatched for only 3.59 MW.</w:t>
+        <w:t xml:space="preserve">Figure 1. Section II dispatch at hour 20. The heat pump covers 103.31 MW of the 110.99 MW heat load and the CHP tops up the rest. On the electricity side G1 sits at its 180 MW cap, all 29.91 MW of available wind is taken, the CHP supplies 103.37 MW at its fuel limit, and the expensive G2 runs for just 3.59 MW.</w:t>
       </w:r>
     </w:p>
     <w:p>
@@ -4227,15 +4227,15 @@
           <w:sz w:val="21"/>
           <w:szCs w:val="21"/>
         </w:rPr>
-        <w:t xml:space="preserve">The convex quadratic part costs almost nothing. </w:t>
-      </w:r>
-      <w:r>
-        <w:rPr>
-          <w:rFonts w:ascii="Calibri" w:cs="Calibri" w:eastAsia="Calibri" w:hAnsi="Calibri"/>
-          <w:sz w:val="21"/>
-          <w:szCs w:val="21"/>
-        </w:rPr>
-        <w:t xml:space="preserve">Eq. (36) is slack by at most 7.2 Pa at hour 1 and exactly 0.0 Pa at hour 20, i.e. it holds with equality at the optimum. This is expected rather than lucky: water pump cost (27) rises with the pressure difference, so the objective pushes the inequality back onto the original quadratic surface. Essentially the entire gap is McCormick's.</w:t>
+        <w:t xml:space="preserve">The convex quadratic part is nearly free. </w:t>
+      </w:r>
+      <w:r>
+        <w:rPr>
+          <w:rFonts w:ascii="Calibri" w:cs="Calibri" w:eastAsia="Calibri" w:hAnsi="Calibri"/>
+          <w:sz w:val="21"/>
+          <w:szCs w:val="21"/>
+        </w:rPr>
+        <w:t xml:space="preserve">Eq. (36) is slack by at most 7.2 Pa at hour 1 and by exactly 0.0 Pa at hour 20, so it holds with equality at the optimum. That is expected rather than lucky: pump cost (27) rises with the pressure difference, so the objective pushes the inequality back onto the original surface. The gap is McCormick's, essentially all of it.</w:t>
       </w:r>
     </w:p>
     <w:p>
@@ -4248,7 +4248,7 @@
           <w:sz w:val="21"/>
           <w:szCs w:val="21"/>
         </w:rPr>
-        <w:t xml:space="preserve">Within McCormick, the residuals track the box widths. At hour 20 the load-implied bounds pin the heat exchanger flow into a 7 kg/s band and the Eq. (21) residual collapses to 1.7e-8 MW — numerically exact — while the station envelope, whose flow stays free over the full 0–301 kg/s equipment range, keeps a residual near 2.6 MW.</w:t>
+        <w:t xml:space="preserve">Inside McCormick, the residuals follow the box widths. At hour 20 the load-implied bounds pin the heat exchanger flow into a 7 kg/s band and the Eq. (21) residual falls to 1.7e-8 MW, numerically exact, while the station envelope — its flow free across the full 0–301 kg/s equipment range — holds a residual near 2.6 MW.</w:t>
       </w:r>
     </w:p>
     <w:p>
@@ -4271,25 +4271,7 @@
           <w:sz w:val="21"/>
           <w:szCs w:val="21"/>
         </w:rPr>
-        <w:t xml:space="preserve">Relaxing the heat exchanger bounds all the way back to the raw equipment limits (7 → 150 kg/s) changes the gap at neither hour: it stays at 0.287 % and 0.889 % to three decimals. That is a useful negative result — the Eq. (21) envelope is simply not what binds here, so tightening it further buys nothing. The gap is carried by the station envelope, whose worst-case slack is c·(mfᵤ−mfₗ)(ΔTᵤ−ΔTₗ)/4 = 19.0 MW on the equipment box. Figure 2 tightens </w:t>
-      </w:r>
-      <w:r>
-        <w:rPr>
-          <w:rFonts w:ascii="Calibri" w:cs="Calibri" w:eastAsia="Calibri" w:hAnsi="Calibri"/>
-          <w:i/>
-          <w:iCs/>
-          <w:sz w:val="21"/>
-          <w:szCs w:val="21"/>
-        </w:rPr>
-        <w:t xml:space="preserve">that</w:t>
-      </w:r>
-      <w:r>
-        <w:rPr>
-          <w:rFonts w:ascii="Calibri" w:cs="Calibri" w:eastAsia="Calibri" w:hAnsi="Calibri"/>
-          <w:sz w:val="21"/>
-          <w:szCs w:val="21"/>
-        </w:rPr>
-        <w:t xml:space="preserve"> bound instead, down to the flow the original model actually uses (279.3 kg/s), holding the Section II reference fixed.</w:t>
+        <w:t xml:space="preserve">Relaxing the heat exchanger bounds all the way back to the equipment limits (7 → 150 kg/s) changes the gap at neither hour: it stays at 0.287 % and 0.889 % to three decimals. That negative result is useful — the Eq. (21) envelope is not what binds, so tightening it buys nothing. The station envelope carries the gap, with worst-case slack c·(mfᵤ−mfₗ)(ΔTᵤ−ΔTₗ)/4 = 19.0 MW on the equipment box. Figure 2 tightens that bound instead, down to the flow the original model actually uses.</w:t>
       </w:r>
     </w:p>
     <w:p>
@@ -4351,7 +4333,7 @@
           <w:sz w:val="17"/>
           <w:szCs w:val="17"/>
         </w:rPr>
-        <w:t xml:space="preserve">Figure 2. Relaxation gap against the worst-case slack the Eq. (24) envelope is allowed, hour 20. Tightening the station flow bound from the 301 kg/s equipment limit to the 280 kg/s the dispatch actually needs cuts the slack from 19.0 to 17.7 MW and the gap from 0.287 % to 0.181 %, a 37 % reduction. The relation is monotone and near-linear: tightness is a property of the bounds supplied, not of the envelope algebra.</w:t>
+        <w:t xml:space="preserve">Figure 2. Relaxation gap against the worst-case slack allowed to the Eq. (24) envelope, hour 20. Tightening the station flow bound from the 301 kg/s equipment limit to the 280 kg/s the dispatch needs cuts the slack from 19.0 to 17.7 MW and the gap from 0.287 % to 0.181 %, a 37 % reduction. The relation is monotone and near-linear: tightness comes from the bounds supplied, not from the envelope algebra.</w:t>
       </w:r>
     </w:p>
     <w:p>
@@ -4374,7 +4356,7 @@
           <w:sz w:val="21"/>
           <w:szCs w:val="21"/>
         </w:rPr>
-        <w:t xml:space="preserve">The paper reports a 3.51 % cost saving for the CHPD against a conventional economic dispatch (CED) over 24 hours. That saving is a </w:t>
+        <w:t xml:space="preserve">The paper reports a 3.51 % saving for the CHPD against a conventional economic dispatch (CED) over 24 hours. That saving is a </w:t>
       </w:r>
       <w:r>
         <w:rPr>
@@ -4392,7 +4374,25 @@
           <w:sz w:val="21"/>
           <w:szCs w:val="21"/>
         </w:rPr>
-        <w:t xml:space="preserve"> effect, and a single time step has nowhere to store anything, so it cannot appear in the results above; at one step the CHPD is expected to cost more than a CED, because it pays for water pumping the CED does not model. To check that the reproduction does behave as the paper describes once storage exists, the CED of Section IV-A and the time delays of Eqs. (6)–(13) were also implemented, beyond what the assignment requires.</w:t>
+        <w:t xml:space="preserve"> effect, and one time step has nowhere to store anything, so it cannot appear above: at a single step the CHPD should cost </w:t>
+      </w:r>
+      <w:r>
+        <w:rPr>
+          <w:rFonts w:ascii="Calibri" w:cs="Calibri" w:eastAsia="Calibri" w:hAnsi="Calibri"/>
+          <w:i/>
+          <w:iCs/>
+          <w:sz w:val="21"/>
+          <w:szCs w:val="21"/>
+        </w:rPr>
+        <w:t xml:space="preserve">more</w:t>
+      </w:r>
+      <w:r>
+        <w:rPr>
+          <w:rFonts w:ascii="Calibri" w:cs="Calibri" w:eastAsia="Calibri" w:hAnsi="Calibri"/>
+          <w:sz w:val="21"/>
+          <w:szCs w:val="21"/>
+        </w:rPr>
+        <w:t xml:space="preserve"> than a CED, because it pays for water pumping the CED ignores. To check that the reproduction behaves as described once storage exists, the CED of Section IV-A and the delays of Eqs. (6)–(13) were built too, beyond what the assignment asks for.</w:t>
       </w:r>
     </w:p>
     <w:tbl>
@@ -4649,7 +4649,7 @@
           <w:sz w:val="21"/>
           <w:szCs w:val="21"/>
         </w:rPr>
-        <w:t xml:space="preserve">The CED reproducing 19277 $ exactly is the strongest single check available, since that one number depends on the data, units, topology and formulation all being right at once. Switching on the delays over a six-hour evening window spanning the sharpest wind drought of the day saves 2.64 % against the identical model with them off, produced by nothing but Eqs. (6)–(13) — the same mechanism the paper reports, at the right order of magnitude for a window of that length. The paper's full-horizon 18600 $ figure is not reproduced: it needs 24 hours with delays, which exceeds the size-limited solver licence available. Obtaining a larger licence was out of scope for this assignment and was not attempted.</w:t>
+        <w:t xml:space="preserve">The CED landing on 19277 $ exactly is the strongest single check available, since that one number depends on the data, units, topology and formulation all being right at once. Switching the delays on over a six-hour evening window, spanning the sharpest wind drought of the day, saves 2.64 % against the same model with them off — produced by nothing but Eqs. (6)–(13), the paper's own mechanism, and the right order of magnitude for a window that long. The full-horizon 18600 $ is not reproduced: that needs 24 hours with delays, which exceeds the size-limited solver licence available. Getting a larger one was out of scope and was not attempted.</w:t>
       </w:r>
     </w:p>
     <w:p>
@@ -4682,25 +4682,7 @@
           <w:sz w:val="21"/>
           <w:szCs w:val="21"/>
         </w:rPr>
-        <w:t xml:space="preserve">The loss term is multiplied by the delay τ, so water crossing a pipe within one step arrives at exactly its inlet temperature. Every single-step result here therefore has zero pipe losses — what the model says, not a coding shortcut, but clearly unphysical: a real pipe loses heat continuously, not in whole-step quanta. The model systematically understates losses at short travel times, precisely where flows are fastest. A subtler issue sits in the same equation: the loss is proportional to the </w:t>
-      </w:r>
-      <w:r>
-        <w:rPr>
-          <w:rFonts w:ascii="Calibri" w:cs="Calibri" w:eastAsia="Calibri" w:hAnsi="Calibri"/>
-          <w:i/>
-          <w:iCs/>
-          <w:sz w:val="21"/>
-          <w:szCs w:val="21"/>
-        </w:rPr>
-        <w:t xml:space="preserve">absolute</w:t>
-      </w:r>
-      <w:r>
-        <w:rPr>
-          <w:rFonts w:ascii="Calibri" w:cs="Calibri" w:eastAsia="Calibri" w:hAnsi="Calibri"/>
-          <w:sz w:val="21"/>
-          <w:szCs w:val="21"/>
-        </w:rPr>
-        <w:t xml:space="preserve"> water temperature rather than to its excess over the surroundings, which implicitly places the ambient at 0 K. A correct formulation would use (T − T_ambient) and would make thermal loss depend on season, a dependence this model cannot represent at all.</w:t>
+        <w:t xml:space="preserve">The loss term is multiplied by τ, so water crossing a pipe inside one step arrives at exactly its inlet temperature. Every single-step result here therefore shows zero pipe losses — what the model says, not a coding shortcut, but plainly unphysical: real pipes lose heat continuously, not in whole-step quanta. The model understates losses at short travel times, precisely where flows are fastest. A subtler problem sits in the same equation: the loss scales with the absolute water temperature rather than its excess over the surroundings, which places the ambient at 0 K. Using (T − T_ambient) would fix it, and would make losses depend on season, which this model cannot represent at all.</w:t>
       </w:r>
     </w:p>
     <w:p>
@@ -4723,7 +4705,7 @@
           <w:sz w:val="21"/>
           <w:szCs w:val="21"/>
         </w:rPr>
-        <w:t xml:space="preserve">An envelope is a single linear hull over the whole box, so no amount of box tightening makes it exact; on the reconstructed data the gap stalled at 23.2 % once the justifiable bounds were in place. The standard remedy is piecewise McCormick — partition the flow range and add one binary per segment — which would tighten it substantially at the cost of making even the single-period problem a mixed-integer program. That is the obvious extension of this work, and was not attempted partly because of the same solver size limit: the delay model already adds roughly 224 constraints per time step on a two-pipe network, and a real network with hundreds of pipes would be intractable in the original form, which is precisely the paper's motivation for relaxing it.</w:t>
+        <w:t xml:space="preserve">An envelope is one linear hull over the whole box, so no amount of tightening makes it exact; on the reconstructed data the gap stalled at 23.2 % once the justifiable bounds were in place. The usual remedy is piecewise McCormick — split the flow range, one binary per segment — which would tighten it considerably at the price of making even the single-period problem mixed-integer. That is the obvious next step, and was not attempted partly for the same reason: the delay model already adds about 224 constraints per time step on a two-pipe network, and a real network of hundreds of pipes would be hopeless in the original form. Which is exactly why the paper relaxes it.</w:t>
       </w:r>
     </w:p>
     <w:p>
@@ -4738,15 +4720,15 @@
           <w:sz w:val="21"/>
           <w:szCs w:val="21"/>
         </w:rPr>
-        <w:t xml:space="preserve">Reproducibility of the case study. </w:t>
-      </w:r>
-      <w:r>
-        <w:rPr>
-          <w:rFonts w:ascii="Calibri" w:cs="Calibri" w:eastAsia="Calibri" w:hAnsi="Calibri"/>
-          <w:sz w:val="21"/>
-          <w:szCs w:val="21"/>
-        </w:rPr>
-        <w:t xml:space="preserve">The appendix PDF and the authors' own reference code disagree on pressure bounds, minimum heat exchanger flow, water density, and even which units are present. The code was followed, since it is what produces the published numbers, and the disagreements were recorded rather than silently reconciled. Their implementation also carries two devices absent from the paper: elastic slacks on the mass balances with a large penalty, and a regularisation on the delays. Neither is reproduced here — the mass balances are hard equalities and close at machine precision unaided — and the CED still reproduces 19277 $ exactly, which suggests those devices are numerical aids rather than load-bearing modelling choices.</w:t>
+        <w:t xml:space="preserve">The case study is hard to reproduce exactly. </w:t>
+      </w:r>
+      <w:r>
+        <w:rPr>
+          <w:rFonts w:ascii="Calibri" w:cs="Calibri" w:eastAsia="Calibri" w:hAnsi="Calibri"/>
+          <w:sz w:val="21"/>
+          <w:szCs w:val="21"/>
+        </w:rPr>
+        <w:t xml:space="preserve">The appendix PDF and the authors' own code disagree on pressure bounds, minimum heat exchanger flow, water density, and even which units exist. The code was followed, since it is what produces the published numbers, and the disagreements were recorded rather than quietly reconciled. Their code also carries two devices the paper never mentions: elastic slacks on the mass balances with a heavy penalty, and a regularisation on the delays. Neither is reproduced here — the mass balances are hard equalities and close at machine precision unaided — and the CED still lands on 19277 $ exactly, which suggests those devices are numerical aids rather than modelling choices.</w:t>
       </w:r>
     </w:p>
     <w:p>
@@ -4769,7 +4751,7 @@
           <w:sz w:val="21"/>
           <w:szCs w:val="21"/>
         </w:rPr>
-        <w:t xml:space="preserve">The Section II formulation and its Section III-B convex relaxation were implemented in full and validated at a single time step on the authors' own data. At both hours examined, both models solve to optimality, the relaxation is a valid lower bound (gaps of 0.89 % and 0.29 %), mass, heat and power balances close at machine precision, the CHP respects its feasible region and the heat pump sits exactly on its conversion characteristic.</w:t>
+        <w:t xml:space="preserve">The Section II formulation and its Section III-B convex relaxation were built in full and validated at a single time step on the authors' own data. At both hours both models solve to optimality, the relaxation is a valid lower bound (gaps of 0.89 % and 0.29 %), mass, heat and power balances close at machine precision, the CHP stays inside its feasible region, and the heat pump sits exactly on its conversion characteristic.</w:t>
       </w:r>
     </w:p>
     <w:p>
@@ -4782,7 +4764,7 @@
           <w:sz w:val="21"/>
           <w:szCs w:val="21"/>
         </w:rPr>
-        <w:t xml:space="preserve">The gap is understood mechanistically rather than merely measured. The convex quadratic reformulation of pressure loss is essentially free, because the pump cost pushes it back onto the original surface, so the whole gap is McCormick's. It is carried by one specific envelope: tightening the station flow bound to the flow actually used cuts the gap by 37 % (Figure 2), while loosening the heat-exchanger bound twentyfold changes it not at all. The lesson is that a McCormick relaxation is only as good as the bounds supplied to it, that those bounds should come from the model's own constraints rather than from equipment nameplates, and that it is worth identifying which envelope actually binds before tightening anything.</w:t>
+        <w:t xml:space="preserve">The gap is explained rather than merely measured. The convex quadratic reformulation is essentially free, because pump cost pushes it back onto the original surface, so the whole gap is McCormick's — and one envelope carries it. Tightening the station flow bound to the flow actually used cuts the gap by 37 %, while loosening the heat exchanger bound twentyfold does nothing at all. A McCormick relaxation is only as good as the bounds it is given, those bounds should come from the model's own constraints rather than equipment nameplates, and it pays to find out which envelope binds before tightening anything.</w:t>
       </w:r>
     </w:p>
     <w:p>
@@ -4795,7 +4777,7 @@
           <w:sz w:val="21"/>
           <w:szCs w:val="21"/>
         </w:rPr>
-        <w:t xml:space="preserve">Beyond the assignment, the CED benchmark reproduces the paper's published 19277 $ exactly, and enabling the pipeline delays over a six-hour window recovers a 2.64 % saving by the storage mechanism the paper describes. The most useful outcomes, though, were the failures: an infeasibility that exposed a misreading of the thermal loss term, a hand-derived test that was wrong where the model was right, and a relaxation gap that turned out to be a statement about variable bounds rather than about the relaxation.</w:t>
+        <w:t xml:space="preserve">Beyond the assignment, the CED reproduces the paper's published 19277 $ exactly, and switching on the pipeline delays over a six-hour window recovers a 2.64 % saving by the storage mechanism the paper describes. The failures taught more than the successes: an infeasibility that exposed a misread loss term, a hand-derived test that was wrong where the model was right, and a relaxation gap that turned out to be a statement about variable bounds.</w:t>
       </w:r>
     </w:p>
     <w:p>

</xml_diff>

<commit_message>
Cut the report to four pages and trim the code comments
Drops the solver cross-check, the hand-derived test anecdote and the
reproducibility reflection. Removes every em dash from the report and the
markdown.
</commit_message>
<xml_diff>
--- a/report/Optimization of Energy Systems Assignment Report.docx
+++ b/report/Optimization of Energy Systems Assignment Report.docx
@@ -213,7 +213,7 @@
           <w:sz w:val="21"/>
           <w:szCs w:val="21"/>
         </w:rPr>
-        <w:t xml:space="preserve">A district heating network delivers heat by pumping hot water from stations out to consumers and returning it cooled. Water takes time to travel down a pipe, so the network stores heat by itself: produce it early, deliver it later.</w:t>
+        <w:t xml:space="preserve">A district heating network delivers heat by pumping hot water out to consumers and returning it cooled. Water takes time to travel down a pipe, so the network stores heat by itself. That matters because an extraction CHP unit cannot choose its heat and power output independently: tied to the heat load, it is pushed off its efficient electrical operating point, and wind may be curtailed to make room for it. If the network can hold heat, the CHP can follow the electricity system instead.</w:t>
       </w:r>
     </w:p>
     <w:p>
@@ -226,20 +226,7 @@
           <w:sz w:val="21"/>
           <w:szCs w:val="21"/>
         </w:rPr>
-        <w:t xml:space="preserve">That matters because an extraction CHP unit cannot choose its heat and power output independently. A CHP tied to the heat load gets pushed off its efficient electrical operating point, and wind may be curtailed to make room for it. Let the network hold heat instead, and the CHP is free to follow the electricity system.</w:t>
-      </w:r>
-    </w:p>
-    <w:p>
-      <w:pPr>
-        <w:spacing w:after="110" w:line="264"/>
-      </w:pPr>
-      <w:r>
-        <w:rPr>
-          <w:rFonts w:ascii="Calibri" w:cs="Calibri" w:eastAsia="Calibri" w:hAnsi="Calibri"/>
-          <w:sz w:val="21"/>
-          <w:szCs w:val="21"/>
-        </w:rPr>
-        <w:t xml:space="preserve">Mitridati and Taylor turn this into a Combined Heat and Power Dispatch (CHPD), co-optimising a DC optimal power flow with the hydraulic and thermal state of the heating network. It is non-convex, so they also give a convex relaxation. This report rebuilds both in Julia/JuMP — the </w:t>
+        <w:t xml:space="preserve">Mitridati and Taylor formalise this as a Combined Heat and Power Dispatch (CHPD), co-optimising a DC optimal power flow with the hydraulic and thermal state of the heating network. It is non-convex, so they also give a convex relaxation. This report rebuilds both in Julia/JuMP, the </w:t>
       </w:r>
       <w:r>
         <w:rPr>
@@ -275,7 +262,7 @@
           <w:sz w:val="21"/>
           <w:szCs w:val="21"/>
         </w:rPr>
-        <w:t xml:space="preserve"> relaxation — and validates them at a single time step, which is the scope of the assignment. A conventional economic dispatch and the pipeline time delays were built as well, and are reported briefly at the end.</w:t>
+        <w:t xml:space="preserve"> relaxation, and validates them at a single time step, which is the scope of the assignment. A conventional economic dispatch and the pipeline delays were built too, and are reported briefly at the end.</w:t>
       </w:r>
     </w:p>
     <w:p>
@@ -298,7 +285,7 @@
           <w:sz w:val="21"/>
           <w:szCs w:val="21"/>
         </w:rPr>
-        <w:t xml:space="preserve">The CHPD minimises operating cost subject to the physics of both networks at once. On the electricity side it is a linearised optimal power flow: generator outputs, voltage angles and line flows. On the heating side it carries the mass flows, nodal pressures and temperatures, and pipe inlet and outlet temperatures, subject to friction, thermal loss, mass balance and temperature mixing. CHP units, heat pumps and water pumps couple the two together.</w:t>
+        <w:t xml:space="preserve">The CHPD minimises operating cost subject to the physics of both networks at once. On the electricity side it is a linearised optimal power flow: generator outputs, voltage angles and line flows. On the heating side it carries mass flows, nodal pressures and temperatures, and pipe inlet and outlet temperatures, subject to friction, thermal loss, mass balance and temperature mixing. CHP units, heat pumps and water pumps couple the two.</w:t>
       </w:r>
     </w:p>
     <w:p>
@@ -311,7 +298,7 @@
           <w:sz w:val="21"/>
           <w:szCs w:val="21"/>
         </w:rPr>
-        <w:t xml:space="preserve">Three features make it hard, and they are why a relaxation is needed:</w:t>
+        <w:t xml:space="preserve">Three things make it hard, and they are why a relaxation is needed:</w:t>
       </w:r>
     </w:p>
     <w:p>
@@ -339,7 +326,7 @@
           <w:sz w:val="21"/>
           <w:szCs w:val="21"/>
         </w:rPr>
-        <w:t xml:space="preserve">Heat carried is a mass flow times a temperature difference, so heat delivered at a load, heat produced at a station, nodal mixing and pump power — Eqs. (16), (17), (21), (24), (27) — are each a product of two variables.</w:t>
+        <w:t xml:space="preserve">Heat carried is a mass flow times a temperature difference, so Eqs. (16), (17), (21), (24) and (27) are each a product of two decision variables.</w:t>
       </w:r>
     </w:p>
     <w:p>
@@ -431,7 +418,7 @@
           <w:sz w:val="21"/>
           <w:szCs w:val="21"/>
         </w:rPr>
-        <w:t xml:space="preserve">Both models use identical data, so any difference between them comes from the formulation alone. The relaxation is built by constructing the Section II model and replacing exactly the constraints the paper replaces, so the two differ nowhere else.</w:t>
+        <w:t xml:space="preserve">Both models use identical data, so any difference comes from the formulation alone. The relaxation is built by taking the Section II model and replacing exactly the constraints the paper replaces.</w:t>
       </w:r>
     </w:p>
     <w:p>
@@ -441,7 +428,7 @@
         <w:outlineLvl w:val="1"/>
       </w:pPr>
       <w:r>
-        <w:t xml:space="preserve">Section II — the original model</w:t>
+        <w:t xml:space="preserve">Section II: the original model</w:t>
       </w:r>
     </w:p>
     <w:p>
@@ -1591,7 +1578,7 @@
         <w:outlineLvl w:val="1"/>
       </w:pPr>
       <w:r>
-        <w:t xml:space="preserve">Section III-B — the convex relaxation</w:t>
+        <w:t xml:space="preserve">Section III-B: the convex relaxation</w:t>
       </w:r>
     </w:p>
     <w:p>
@@ -1720,7 +1707,7 @@
           <w:sz w:val="21"/>
           <w:szCs w:val="21"/>
         </w:rPr>
-        <w:t xml:space="preserve">For (21) and (24) the envelope uses ΔT = TS − TR as a single variable rather than TS and TR separately — one product instead of two, over a much narrower interval.</w:t>
+        <w:t xml:space="preserve">For (21) and (24) the envelope uses ΔT = TS − TR as one variable rather than TS and TR separately. That is one product instead of two, over a much narrower interval.</w:t>
       </w:r>
     </w:p>
     <w:p>
@@ -1784,7 +1771,7 @@
           <w:sz w:val="21"/>
           <w:szCs w:val="21"/>
         </w:rPr>
-        <w:t xml:space="preserve">A single entry point drives the study, </w:t>
+        <w:t xml:space="preserve">One entry point drives the study, </w:t>
       </w:r>
       <w:r>
         <w:rPr>
@@ -1800,7 +1787,7 @@
           <w:sz w:val="21"/>
           <w:szCs w:val="21"/>
         </w:rPr>
-        <w:t xml:space="preserve">, taking the horizon, start hour and delay switch as command-line arguments, so nothing has to be edited to change what is solved. Gurobi solves the non-convex Section II by spatial branch and bound (</w:t>
+        <w:t xml:space="preserve">, with the horizon, start hour and delay switch given as command-line arguments. Gurobi solves the non-convex Section II by spatial branch and bound (</w:t>
       </w:r>
       <w:r>
         <w:rPr>
@@ -1816,7 +1803,7 @@
           <w:sz w:val="21"/>
           <w:szCs w:val="21"/>
         </w:rPr>
-        <w:t xml:space="preserve">), which returns a certified global optimum; Section III-B is convex. Without a licensed Gurobi the code falls back to Ipopt and HiGHS, so it still runs.</w:t>
+        <w:t xml:space="preserve">), returning a certified global optimum; Section III-B is convex. Without a Gurobi licence the code falls back to Ipopt and HiGHS.</w:t>
       </w:r>
     </w:p>
     <w:p>
@@ -2135,7 +2122,7 @@
           <w:sz w:val="21"/>
           <w:szCs w:val="21"/>
         </w:rPr>
-        <w:t xml:space="preserve">The first of these is the one to settle with the lecturer or TA rather than assume. The nomenclature calls ρE and ρH fuel efficiencies, yet they multiply outputs and are compared against a fuel limit, which only balances dimensionally if they are the reciprocals. Taking them as written would change the CHP's fuel constraint and its cost by a factor of ρ², so the choice is not cosmetic. It is adopted because it is the only dimensionally coherent reading, and because the CED then reproduces the paper's published cost exactly — but it stays an assumption worth confirming.</w:t>
+        <w:t xml:space="preserve">The first is worth settling with the lecturer or TA rather than assuming. The nomenclature calls ρE and ρH fuel efficiencies, yet they multiply outputs and are compared against a fuel limit, which only balances dimensionally if they are the reciprocals. Reading them as written would change the CHP's fuel constraint and its cost by a factor of ρ². The reciprocal reading is adopted because it is the only dimensionally coherent one, and because the CED then reproduces the paper's published cost exactly.</w:t>
       </w:r>
     </w:p>
     <w:p>
@@ -2168,7 +2155,7 @@
           <w:sz w:val="21"/>
           <w:szCs w:val="21"/>
         </w:rPr>
-        <w:t xml:space="preserve">On an earlier case study rebuilt from the paper's figures, the first relaxed run came back 50 % under the original. The formulation was fine; the flow bounds were equipment nameplates while the real flows sat in a narrow band. For w = x·y the McCormick hull can sit (xᵤ−xₗ)(yᵤ−yₗ)/4 from the true surface — 83 MW of slack on a 98 MW load, enough to serve it without moving any water. Bounds implied by the model's own constraints closed that to 23.2 %, and on the authors' data it is under 1 %.</w:t>
+        <w:t xml:space="preserve">On an earlier case study rebuilt from the paper's figures, the first relaxed run came back 50 % under the original. The formulation was fine. The flow bounds were equipment nameplates while the real flows sat in a narrow band, and for w = x·y the McCormick hull can sit (xᵤ−xₗ)(yᵤ−yₗ)/4 from the true surface: 83 MW of slack on a 98 MW load, enough to serve it without moving any water. Bounds implied by the model's own constraints closed that to 23.2 %, and on the authors' data it is under 1 %.</w:t>
       </w:r>
     </w:p>
     <w:p>
@@ -2191,7 +2178,7 @@
           <w:sz w:val="21"/>
           <w:szCs w:val="21"/>
         </w:rPr>
-        <w:t xml:space="preserve">The loss bracket in Eq. (5) is multiplied by the delay τ, so at τ = 0 it equals one and a pipe crossed inside one step loses nothing — but the code was charging a full step of loss. On the reconstruction that only inflated losses; on the authors' data it made the model </w:t>
+        <w:t xml:space="preserve">The loss bracket in Eq. (5) is multiplied by the delay τ, so at τ = 0 it equals one and a pipe crossed inside one step loses nothing. The code was charging a full step of loss. On the reconstruction that only inflated losses; on the authors' data it made the model </w:t>
       </w:r>
       <w:r>
         <w:rPr>
@@ -2209,66 +2196,7 @@
           <w:sz w:val="21"/>
           <w:szCs w:val="21"/>
         </w:rPr>
-        <w:t xml:space="preserve">, since their pipes lose 4.27 % of absolute temperature per step and two in series drop a 393.15 K supply below the 363.15 K floor of Eq. (18). The infeasibility is what found it. The second bug was the missing zero-delay consistency bound in Table 2.</w:t>
-      </w:r>
-    </w:p>
-    <w:p>
-      <w:pPr>
-        <w:spacing w:after="110" w:line="264"/>
-      </w:pPr>
-      <w:r>
-        <w:rPr>
-          <w:rFonts w:ascii="Calibri" w:cs="Calibri" w:eastAsia="Calibri" w:hAnsi="Calibri"/>
-          <w:b/>
-          <w:bCs/>
-          <w:sz w:val="21"/>
-          <w:szCs w:val="21"/>
-        </w:rPr>
-        <w:t xml:space="preserve">An unlicensed solver turned into a cross-check. </w:t>
-      </w:r>
-      <w:r>
-        <w:rPr>
-          <w:rFonts w:ascii="Calibri" w:cs="Calibri" w:eastAsia="Calibri" w:hAnsi="Calibri"/>
-          <w:sz w:val="21"/>
-          <w:szCs w:val="21"/>
-        </w:rPr>
-        <w:t xml:space="preserve">Early work ran on Ipopt, which finds a </w:t>
-      </w:r>
-      <w:r>
-        <w:rPr>
-          <w:rFonts w:ascii="Calibri" w:cs="Calibri" w:eastAsia="Calibri" w:hAnsi="Calibri"/>
-          <w:i/>
-          <w:iCs/>
-          <w:sz w:val="21"/>
-          <w:szCs w:val="21"/>
-        </w:rPr>
-        <w:t xml:space="preserve">local</w:t>
-      </w:r>
-      <w:r>
-        <w:rPr>
-          <w:rFonts w:ascii="Calibri" w:cs="Calibri" w:eastAsia="Calibri" w:hAnsi="Calibri"/>
-          <w:sz w:val="21"/>
-          <w:szCs w:val="21"/>
-        </w:rPr>
-        <w:t xml:space="preserve"> solution of the non-convex Section II where Gurobi returns a certified </w:t>
-      </w:r>
-      <w:r>
-        <w:rPr>
-          <w:rFonts w:ascii="Calibri" w:cs="Calibri" w:eastAsia="Calibri" w:hAnsi="Calibri"/>
-          <w:i/>
-          <w:iCs/>
-          <w:sz w:val="21"/>
-          <w:szCs w:val="21"/>
-        </w:rPr>
-        <w:t xml:space="preserve">global</w:t>
-      </w:r>
-      <w:r>
-        <w:rPr>
-          <w:rFonts w:ascii="Calibri" w:cs="Calibri" w:eastAsia="Calibri" w:hAnsi="Calibri"/>
-          <w:sz w:val="21"/>
-          <w:szCs w:val="21"/>
-        </w:rPr>
-        <w:t xml:space="preserve"> one. The two agreed to six significant figures, which suggests this case has no stray local optima.</w:t>
+        <w:t xml:space="preserve">, because their pipes lose 4.27 % of absolute temperature per step and two in series drop a 393.15 K supply below the 363.15 K floor of Eq. (18). The second was the missing zero-delay consistency bound in Table 2.</w:t>
       </w:r>
     </w:p>
     <w:p>
@@ -2291,20 +2219,7 @@
           <w:sz w:val="21"/>
           <w:szCs w:val="21"/>
         </w:rPr>
-        <w:t xml:space="preserve">No claim here rests on an objective value alone. Four checks stand behind it: 15 unit tests, one confirming that the McCormick helper reproduces a known product exactly at the corners of its box and brackets it inside; a two-node network whose optimum is derived by hand and matched to 1e-4; physical checks on the solution; and confirmation that the relaxation bounds the original from below.</w:t>
-      </w:r>
-    </w:p>
-    <w:p>
-      <w:pPr>
-        <w:spacing w:after="110" w:line="264"/>
-      </w:pPr>
-      <w:r>
-        <w:rPr>
-          <w:rFonts w:ascii="Calibri" w:cs="Calibri" w:eastAsia="Calibri" w:hAnsi="Calibri"/>
-          <w:sz w:val="21"/>
-          <w:szCs w:val="21"/>
-        </w:rPr>
-        <w:t xml:space="preserve">The hand-derived test earned its place. Its first version assumed the return temperature at the load would sit on its own lower bound, and it failed. The model was right: the water arrives already cooled, so the bound at the far end of the pipe binds first. The derivation was wrong, not the code.</w:t>
+        <w:t xml:space="preserve">No claim here rests on an objective value alone. Fifteen unit tests cover the McCormick helper and a two-node network whose optimum is derived by hand and matched to 1e-4, and every reported solution is checked for mass, heat and power balance, CHP feasibility and heat pump conversion.</w:t>
       </w:r>
     </w:p>
     <w:p>
@@ -2327,7 +2242,7 @@
           <w:sz w:val="21"/>
           <w:szCs w:val="21"/>
         </w:rPr>
-        <w:t xml:space="preserve">Everything below uses the authors' own data, from their online appendix (doi:10.5281/zenodo.1195508) and reference code. The system is a 6-bus network whose first three buses are also the DHN nodes, arranged in a line: node 1 (heat pump HP1, wind W1) → node 2 (CHP1, generator G2) → node 3 (the heat load HES1); parameters are in Appendix A. Every node has at most one arriving pipe, so Eqs. (19)/(20) apply throughout and the mixing equations (16)/(17) never bind — their envelopes are correct but have nothing to relax here, as the measured mixing residuals of exactly zero confirm. Only (21), (24) and (27) are actually relaxed.</w:t>
+        <w:t xml:space="preserve">Everything below uses the authors' own data, from their online appendix (doi:10.5281/zenodo.1195508) and reference code. The system is a 6-bus network whose first three buses are also the DHN nodes, in a line: node 1 (heat pump HP1, wind W1) → node 2 (CHP1, generator G2) → node 3 (the heat load HES1). Every node has at most one arriving pipe, so Eqs. (19)/(20) apply throughout and the mixing equations (16)/(17) never bind. Only (21), (24) and (27) are actually relaxed.</w:t>
       </w:r>
     </w:p>
     <w:tbl>
@@ -2401,7 +2316,7 @@
                 <w:sz w:val="18"/>
                 <w:szCs w:val="18"/>
               </w:rPr>
-              <w:t xml:space="preserve">Hour 1 — wind-rich</w:t>
+              <w:t xml:space="preserve">Hour 1 (wind-rich)</w:t>
             </w:r>
           </w:p>
         </w:tc>
@@ -2428,7 +2343,7 @@
                 <w:sz w:val="18"/>
                 <w:szCs w:val="18"/>
               </w:rPr>
-              <w:t xml:space="preserve">Hour 20 — wind-scarce</w:t>
+              <w:t xml:space="preserve">Hour 20 (wind-scarce)</w:t>
             </w:r>
           </w:p>
         </w:tc>
@@ -2987,7 +2902,7 @@
           <w:sz w:val="21"/>
           <w:szCs w:val="21"/>
         </w:rPr>
-        <w:t xml:space="preserve">Hour 1 is degenerate, and is here only to validate: near-free wind covers all demand, CHP1 sits at P = Q = 0, and the total cost is two cents, so its cost comparisons mean nothing. Hour 20 is the interesting one. Wind collapses just as the heat load peaks, exhausting every cheap resource — all available wind is taken, G1 runs at its 180 MW cap, and CHP1 hits its fuel limit at exactly 250.0 of 250.0 MW — which leaves the expensive G2 to cover the last 3.59 MW (Figure 1). The dispatch closes: 316.87 MW generated against 275 MW of load plus 41.32 MW of heat pump and 0.54 MW of water pump demand.</w:t>
+        <w:t xml:space="preserve">Hour 1 is degenerate and is here only to validate: near-free wind covers all demand, CHP1 sits at P = Q = 0, and the total cost is two cents. Hour 20 is the interesting one. Wind collapses as the heat load peaks, so every cheap resource is exhausted. All available wind is taken, G1 runs at its 180 MW cap, CHP1 hits its fuel limit at exactly 250.0 of 250.0 MW, and the expensive G2 covers the last 3.59 MW (Figure 1).</w:t>
       </w:r>
     </w:p>
     <w:p>
@@ -3049,7 +2964,7 @@
           <w:sz w:val="17"/>
           <w:szCs w:val="17"/>
         </w:rPr>
-        <w:t xml:space="preserve">Figure 1. Section II dispatch at hour 20. The heat pump covers 103.31 MW of the 110.99 MW heat load and the CHP tops up the rest. On the electricity side G1 sits at its 180 MW cap, all 29.91 MW of available wind is taken, the CHP supplies 103.37 MW at its fuel limit, and the expensive G2 runs for just 3.59 MW.</w:t>
+        <w:t xml:space="preserve">Figure 1. Section II dispatch at hour 20. The heat pump covers 103.31 MW of the 110.99 MW heat load. On the electricity side G1 sits at its cap, all available wind is taken, the CHP is at its fuel limit, and G2 runs for only 3.59 MW.</w:t>
       </w:r>
     </w:p>
     <w:p>
@@ -4235,7 +4150,7 @@
           <w:sz w:val="21"/>
           <w:szCs w:val="21"/>
         </w:rPr>
-        <w:t xml:space="preserve">Eq. (36) is slack by at most 7.2 Pa at hour 1 and by exactly 0.0 Pa at hour 20, so it holds with equality at the optimum. That is expected rather than lucky: pump cost (27) rises with the pressure difference, so the objective pushes the inequality back onto the original surface. The gap is McCormick's, essentially all of it.</w:t>
+        <w:t xml:space="preserve">Eq. (36) is slack by at most 7.2 Pa at hour 1 and by exactly 0.0 Pa at hour 20, so it holds with equality at the optimum. Pump cost (27) rises with the pressure difference, so the objective pushes the inequality back onto the original surface. Essentially the whole gap is McCormick's.</w:t>
       </w:r>
     </w:p>
     <w:p>
@@ -4248,7 +4163,7 @@
           <w:sz w:val="21"/>
           <w:szCs w:val="21"/>
         </w:rPr>
-        <w:t xml:space="preserve">Inside McCormick, the residuals follow the box widths. At hour 20 the load-implied bounds pin the heat exchanger flow into a 7 kg/s band and the Eq. (21) residual falls to 1.7e-8 MW, numerically exact, while the station envelope — its flow free across the full 0–301 kg/s equipment range — holds a residual near 2.6 MW.</w:t>
+        <w:t xml:space="preserve">Inside McCormick the residuals follow the box widths. At hour 20 the load-implied bounds pin the heat exchanger flow into a 7 kg/s band and the Eq. (21) residual falls to 1.7e-8 MW, numerically exact, while the station envelope keeps a residual near 2.6 MW with its flow free across the full 0–301 kg/s range.</w:t>
       </w:r>
     </w:p>
     <w:p>
@@ -4271,7 +4186,7 @@
           <w:sz w:val="21"/>
           <w:szCs w:val="21"/>
         </w:rPr>
-        <w:t xml:space="preserve">Relaxing the heat exchanger bounds all the way back to the equipment limits (7 → 150 kg/s) changes the gap at neither hour: it stays at 0.287 % and 0.889 % to three decimals. That negative result is useful — the Eq. (21) envelope is not what binds, so tightening it buys nothing. The station envelope carries the gap, with worst-case slack c·(mfᵤ−mfₗ)(ΔTᵤ−ΔTₗ)/4 = 19.0 MW on the equipment box. Figure 2 tightens that bound instead, down to the flow the original model actually uses.</w:t>
+        <w:t xml:space="preserve">Relaxing the heat exchanger bounds back to the raw equipment limits (7 to 150 kg/s) changes the gap at neither hour: it stays at 0.287 % and 0.889 % to three decimals. That envelope is not what binds, so tightening it buys nothing. The station envelope carries the gap, with worst-case slack c·(mfᵤ−mfₗ)(ΔTᵤ−ΔTₗ)/4 = 19.0 MW. Figure 2 tightens that bound instead.</w:t>
       </w:r>
     </w:p>
     <w:p>
@@ -4333,7 +4248,7 @@
           <w:sz w:val="17"/>
           <w:szCs w:val="17"/>
         </w:rPr>
-        <w:t xml:space="preserve">Figure 2. Relaxation gap against the worst-case slack allowed to the Eq. (24) envelope, hour 20. Tightening the station flow bound from the 301 kg/s equipment limit to the 280 kg/s the dispatch needs cuts the slack from 19.0 to 17.7 MW and the gap from 0.287 % to 0.181 %, a 37 % reduction. The relation is monotone and near-linear: tightness comes from the bounds supplied, not from the envelope algebra.</w:t>
+        <w:t xml:space="preserve">Figure 2. Relaxation gap against the worst-case slack allowed to the Eq. (24) envelope, hour 20. Tightening the station flow bound from 301 to 280 kg/s cuts the slack from 19.0 to 17.7 MW and the gap from 0.287 % to 0.181 %, a 37 % reduction.</w:t>
       </w:r>
     </w:p>
     <w:p>
@@ -4374,25 +4289,7 @@
           <w:sz w:val="21"/>
           <w:szCs w:val="21"/>
         </w:rPr>
-        <w:t xml:space="preserve"> effect, and one time step has nowhere to store anything, so it cannot appear above: at a single step the CHPD should cost </w:t>
-      </w:r>
-      <w:r>
-        <w:rPr>
-          <w:rFonts w:ascii="Calibri" w:cs="Calibri" w:eastAsia="Calibri" w:hAnsi="Calibri"/>
-          <w:i/>
-          <w:iCs/>
-          <w:sz w:val="21"/>
-          <w:szCs w:val="21"/>
-        </w:rPr>
-        <w:t xml:space="preserve">more</w:t>
-      </w:r>
-      <w:r>
-        <w:rPr>
-          <w:rFonts w:ascii="Calibri" w:cs="Calibri" w:eastAsia="Calibri" w:hAnsi="Calibri"/>
-          <w:sz w:val="21"/>
-          <w:szCs w:val="21"/>
-        </w:rPr>
-        <w:t xml:space="preserve"> than a CED, because it pays for water pumping the CED ignores. To check that the reproduction behaves as described once storage exists, the CED of Section IV-A and the delays of Eqs. (6)–(13) were built too, beyond what the assignment asks for.</w:t>
+        <w:t xml:space="preserve"> effect, and one time step has nowhere to store anything, so it cannot appear above. At a single step the CHPD should cost more than a CED, because it pays for water pumping the CED ignores. The CED and the delays were built to check that.</w:t>
       </w:r>
     </w:p>
     <w:tbl>
@@ -4515,7 +4412,7 @@
                 <w:sz w:val="18"/>
                 <w:szCs w:val="18"/>
               </w:rPr>
-              <w:t xml:space="preserve">19276.98 $  (paper: 19277 $ — reproduced exactly)</w:t>
+              <w:t xml:space="preserve">19276.98 $  (paper: 19277 $, reproduced exactly)</w:t>
             </w:r>
           </w:p>
         </w:tc>
@@ -4649,7 +4546,7 @@
           <w:sz w:val="21"/>
           <w:szCs w:val="21"/>
         </w:rPr>
-        <w:t xml:space="preserve">The CED landing on 19277 $ exactly is the strongest single check available, since that one number depends on the data, units, topology and formulation all being right at once. Switching the delays on over a six-hour evening window, spanning the sharpest wind drought of the day, saves 2.64 % against the same model with them off — produced by nothing but Eqs. (6)–(13), the paper's own mechanism, and the right order of magnitude for a window that long. The full-horizon 18600 $ is not reproduced: that needs 24 hours with delays, which exceeds the size-limited solver licence available. Getting a larger one was out of scope and was not attempted.</w:t>
+        <w:t xml:space="preserve">The CED landing on 19277 $ exactly is the strongest single check available, since that number depends on the data, units, topology and formulation all being right at once. With the delays on over a six-hour evening window the model saves 2.64 %, produced by nothing but Eqs. (6)–(13). The full 24 hours with delays exceeds the size-limited solver licence, so the paper's 18600 $ is not reproduced.</w:t>
       </w:r>
     </w:p>
     <w:p>
@@ -4682,7 +4579,7 @@
           <w:sz w:val="21"/>
           <w:szCs w:val="21"/>
         </w:rPr>
-        <w:t xml:space="preserve">The loss term is multiplied by τ, so water crossing a pipe inside one step arrives at exactly its inlet temperature. Every single-step result here therefore shows zero pipe losses — what the model says, not a coding shortcut, but plainly unphysical: real pipes lose heat continuously, not in whole-step quanta. The model understates losses at short travel times, precisely where flows are fastest. A subtler problem sits in the same equation: the loss scales with the absolute water temperature rather than its excess over the surroundings, which places the ambient at 0 K. Using (T − T_ambient) would fix it, and would make losses depend on season, which this model cannot represent at all.</w:t>
+        <w:t xml:space="preserve">The loss term is multiplied by τ, so water crossing a pipe inside one step arrives at exactly its inlet temperature, and every single-step result here shows zero pipe losses. That is what the model says, but it is not physical: a real pipe loses heat continuously, not in whole-step quanta, so the model understates losses exactly where flows are fastest. The same equation scales loss with absolute water temperature rather than its excess over the surroundings, which places the ambient at 0 K.</w:t>
       </w:r>
     </w:p>
     <w:p>
@@ -4705,30 +4602,7 @@
           <w:sz w:val="21"/>
           <w:szCs w:val="21"/>
         </w:rPr>
-        <w:t xml:space="preserve">An envelope is one linear hull over the whole box, so no amount of tightening makes it exact; on the reconstructed data the gap stalled at 23.2 % once the justifiable bounds were in place. The usual remedy is piecewise McCormick — split the flow range, one binary per segment — which would tighten it considerably at the price of making even the single-period problem mixed-integer. That is the obvious next step, and was not attempted partly for the same reason: the delay model already adds about 224 constraints per time step on a two-pipe network, and a real network of hundreds of pipes would be hopeless in the original form. Which is exactly why the paper relaxes it.</w:t>
-      </w:r>
-    </w:p>
-    <w:p>
-      <w:pPr>
-        <w:spacing w:after="110" w:line="264"/>
-      </w:pPr>
-      <w:r>
-        <w:rPr>
-          <w:rFonts w:ascii="Calibri" w:cs="Calibri" w:eastAsia="Calibri" w:hAnsi="Calibri"/>
-          <w:b/>
-          <w:bCs/>
-          <w:sz w:val="21"/>
-          <w:szCs w:val="21"/>
-        </w:rPr>
-        <w:t xml:space="preserve">The case study is hard to reproduce exactly. </w:t>
-      </w:r>
-      <w:r>
-        <w:rPr>
-          <w:rFonts w:ascii="Calibri" w:cs="Calibri" w:eastAsia="Calibri" w:hAnsi="Calibri"/>
-          <w:sz w:val="21"/>
-          <w:szCs w:val="21"/>
-        </w:rPr>
-        <w:t xml:space="preserve">The appendix PDF and the authors' own code disagree on pressure bounds, minimum heat exchanger flow, water density, and even which units exist. The code was followed, since it is what produces the published numbers, and the disagreements were recorded rather than quietly reconciled. Their code also carries two devices the paper never mentions: elastic slacks on the mass balances with a heavy penalty, and a regularisation on the delays. Neither is reproduced here — the mass balances are hard equalities and close at machine precision unaided — and the CED still lands on 19277 $ exactly, which suggests those devices are numerical aids rather than modelling choices.</w:t>
+        <w:t xml:space="preserve">An envelope is one linear hull over the whole box, so no amount of tightening makes it exact; on the reconstructed data the gap stalled at 23.2 % once the justifiable bounds were in place. The usual remedy is piecewise McCormick, splitting the flow range with one binary per segment, which would tighten it at the cost of making even the single-period problem mixed-integer. That was not attempted here.</w:t>
       </w:r>
     </w:p>
     <w:p>
@@ -4751,7 +4625,7 @@
           <w:sz w:val="21"/>
           <w:szCs w:val="21"/>
         </w:rPr>
-        <w:t xml:space="preserve">The Section II formulation and its Section III-B convex relaxation were built in full and validated at a single time step on the authors' own data. At both hours both models solve to optimality, the relaxation is a valid lower bound (gaps of 0.89 % and 0.29 %), mass, heat and power balances close at machine precision, the CHP stays inside its feasible region, and the heat pump sits exactly on its conversion characteristic.</w:t>
+        <w:t xml:space="preserve">The Section II formulation and its Section III-B relaxation were built in full and validated at a single time step on the authors' own data. At both hours both models solve to optimality, the relaxation is a valid lower bound with gaps of 0.89 % and 0.29 %, and mass, heat and power balances close at machine precision.</w:t>
       </w:r>
     </w:p>
     <w:p>
@@ -4764,20 +4638,7 @@
           <w:sz w:val="21"/>
           <w:szCs w:val="21"/>
         </w:rPr>
-        <w:t xml:space="preserve">The gap is explained rather than merely measured. The convex quadratic reformulation is essentially free, because pump cost pushes it back onto the original surface, so the whole gap is McCormick's — and one envelope carries it. Tightening the station flow bound to the flow actually used cuts the gap by 37 %, while loosening the heat exchanger bound twentyfold does nothing at all. A McCormick relaxation is only as good as the bounds it is given, those bounds should come from the model's own constraints rather than equipment nameplates, and it pays to find out which envelope binds before tightening anything.</w:t>
-      </w:r>
-    </w:p>
-    <w:p>
-      <w:pPr>
-        <w:spacing w:after="110" w:line="264"/>
-      </w:pPr>
-      <w:r>
-        <w:rPr>
-          <w:rFonts w:ascii="Calibri" w:cs="Calibri" w:eastAsia="Calibri" w:hAnsi="Calibri"/>
-          <w:sz w:val="21"/>
-          <w:szCs w:val="21"/>
-        </w:rPr>
-        <w:t xml:space="preserve">Beyond the assignment, the CED reproduces the paper's published 19277 $ exactly, and switching on the pipeline delays over a six-hour window recovers a 2.64 % saving by the storage mechanism the paper describes. The failures taught more than the successes: an infeasibility that exposed a misread loss term, a hand-derived test that was wrong where the model was right, and a relaxation gap that turned out to be a statement about variable bounds.</w:t>
+        <w:t xml:space="preserve">The gap is explained rather than just measured. The convex quadratic part is nearly free, so the whole gap is McCormick's, and one envelope carries it: tightening the station flow bound to the flow actually used cuts the gap by 37 %, while loosening the heat exchanger bound twentyfold does nothing at all. A McCormick relaxation is only as good as the bounds it is given, and it pays to find which envelope binds before tightening anything.</w:t>
       </w:r>
     </w:p>
     <w:p>
@@ -4841,7 +4702,7 @@
           <w:sz w:val="21"/>
           <w:szCs w:val="21"/>
         </w:rPr>
-        <w:t xml:space="preserve">Power Systems Flexibility from District Heating Networks — Online Appendix</w:t>
+        <w:t xml:space="preserve">Power Systems Flexibility from District Heating Networks - Online Appendix</w:t>
       </w:r>
       <w:r>
         <w:rPr>
@@ -4926,7 +4787,7 @@
         <w:outlineLvl w:val="0"/>
       </w:pPr>
       <w:r>
-        <w:t xml:space="preserve">Appendix A — Case study data</w:t>
+        <w:t xml:space="preserve">Appendix A: Case study data</w:t>
       </w:r>
     </w:p>
     <w:p>
@@ -5653,7 +5514,7 @@
         <w:outlineLvl w:val="0"/>
       </w:pPr>
       <w:r>
-        <w:t xml:space="preserve">Appendix B — Equation-to-code map</w:t>
+        <w:t xml:space="preserve">Appendix B: Equation-to-code map</w:t>
       </w:r>
     </w:p>
     <w:p>

</xml_diff>

<commit_message>
Restore the solver cross-check and the reproducibility reflection
Both in compressed form. The cross-check is evidence that Section II has no
stray local optima, and the disagreements between the appendix PDF and the
authors' code are worth recording.
</commit_message>
<xml_diff>
--- a/report/Optimization of Energy Systems Assignment Report.docx
+++ b/report/Optimization of Energy Systems Assignment Report.docx
@@ -2201,6 +2201,65 @@
     </w:p>
     <w:p>
       <w:pPr>
+        <w:spacing w:after="110" w:line="264"/>
+      </w:pPr>
+      <w:r>
+        <w:rPr>
+          <w:rFonts w:ascii="Calibri" w:cs="Calibri" w:eastAsia="Calibri" w:hAnsi="Calibri"/>
+          <w:b/>
+          <w:bCs/>
+          <w:sz w:val="21"/>
+          <w:szCs w:val="21"/>
+        </w:rPr>
+        <w:t xml:space="preserve">An unlicensed solver turned into a cross-check. </w:t>
+      </w:r>
+      <w:r>
+        <w:rPr>
+          <w:rFonts w:ascii="Calibri" w:cs="Calibri" w:eastAsia="Calibri" w:hAnsi="Calibri"/>
+          <w:sz w:val="21"/>
+          <w:szCs w:val="21"/>
+        </w:rPr>
+        <w:t xml:space="preserve">Early work ran on Ipopt, which finds a </w:t>
+      </w:r>
+      <w:r>
+        <w:rPr>
+          <w:rFonts w:ascii="Calibri" w:cs="Calibri" w:eastAsia="Calibri" w:hAnsi="Calibri"/>
+          <w:i/>
+          <w:iCs/>
+          <w:sz w:val="21"/>
+          <w:szCs w:val="21"/>
+        </w:rPr>
+        <w:t xml:space="preserve">local</w:t>
+      </w:r>
+      <w:r>
+        <w:rPr>
+          <w:rFonts w:ascii="Calibri" w:cs="Calibri" w:eastAsia="Calibri" w:hAnsi="Calibri"/>
+          <w:sz w:val="21"/>
+          <w:szCs w:val="21"/>
+        </w:rPr>
+        <w:t xml:space="preserve"> solution of the non-convex Section II where Gurobi returns a certified </w:t>
+      </w:r>
+      <w:r>
+        <w:rPr>
+          <w:rFonts w:ascii="Calibri" w:cs="Calibri" w:eastAsia="Calibri" w:hAnsi="Calibri"/>
+          <w:i/>
+          <w:iCs/>
+          <w:sz w:val="21"/>
+          <w:szCs w:val="21"/>
+        </w:rPr>
+        <w:t xml:space="preserve">global</w:t>
+      </w:r>
+      <w:r>
+        <w:rPr>
+          <w:rFonts w:ascii="Calibri" w:cs="Calibri" w:eastAsia="Calibri" w:hAnsi="Calibri"/>
+          <w:sz w:val="21"/>
+          <w:szCs w:val="21"/>
+        </w:rPr>
+        <w:t xml:space="preserve"> one. The two agree to six significant figures, which suggests this case has no stray local optima.</w:t>
+      </w:r>
+    </w:p>
+    <w:p>
+      <w:pPr>
         <w:pStyle w:val="Heading2"/>
         <w:spacing w:after="120" w:before="240"/>
         <w:outlineLvl w:val="1"/>
@@ -4603,6 +4662,29 @@
           <w:szCs w:val="21"/>
         </w:rPr>
         <w:t xml:space="preserve">An envelope is one linear hull over the whole box, so no amount of tightening makes it exact; on the reconstructed data the gap stalled at 23.2 % once the justifiable bounds were in place. The usual remedy is piecewise McCormick, splitting the flow range with one binary per segment, which would tighten it at the cost of making even the single-period problem mixed-integer. That was not attempted here.</w:t>
+      </w:r>
+    </w:p>
+    <w:p>
+      <w:pPr>
+        <w:spacing w:after="110" w:line="264"/>
+      </w:pPr>
+      <w:r>
+        <w:rPr>
+          <w:rFonts w:ascii="Calibri" w:cs="Calibri" w:eastAsia="Calibri" w:hAnsi="Calibri"/>
+          <w:b/>
+          <w:bCs/>
+          <w:sz w:val="21"/>
+          <w:szCs w:val="21"/>
+        </w:rPr>
+        <w:t xml:space="preserve">The case study is hard to reproduce exactly. </w:t>
+      </w:r>
+      <w:r>
+        <w:rPr>
+          <w:rFonts w:ascii="Calibri" w:cs="Calibri" w:eastAsia="Calibri" w:hAnsi="Calibri"/>
+          <w:sz w:val="21"/>
+          <w:szCs w:val="21"/>
+        </w:rPr>
+        <w:t xml:space="preserve">The appendix PDF and the authors' own code disagree on pressure bounds, minimum heat exchanger flow, water density, and which units exist. The code was followed, since it is what produces the published numbers. Their code also carries elastic slacks on the mass balances and a regularisation on the delays, neither mentioned in the paper and neither reproduced here. The CED still lands on 19277 $ exactly, so those look like numerical aids rather than modelling choices.</w:t>
       </w:r>
     </w:p>
     <w:p>

</xml_diff>